<commit_message>
vpscreen-scan: Initiate capacity expansion parallel processing (5 agents × 20 stocks)
</commit_message>
<xml_diff>
--- a/projects/valuepickr-open-screen/docs/Avalon Technologies.docx
+++ b/projects/valuepickr-open-screen/docs/Avalon Technologies.docx
@@ -515,6 +515,34 @@
           <w:szCs w:val="24"/>
         </w:rPr>
         <w:t xml:space="preserve">neither - strong execution and a real EMS tailwind, but at a ~Rs 15,000 Cr market cap, ~17% ROE and a premium multiple there is no credible path to a 10x in 2-3 years or a 100x in 10 years</w:t>
+      </w:r>
+    </w:p>
+    <w:p>
+      <w:pPr>
+        <w:spacing w:after="120"/>
+      </w:pPr>
+      <w:r>
+        <w:rPr>
+          <w:color w:val="666666"/>
+          <w:sz w:val="20"/>
+          <w:szCs w:val="20"/>
+        </w:rPr>
+        <w:t xml:space="preserve">4-box gate — tailwind: yes · TAM: no · moat: yes · valuation: no  (score 2 / 4)</w:t>
+      </w:r>
+    </w:p>
+    <w:p>
+      <w:pPr>
+        <w:spacing w:after="120"/>
+      </w:pPr>
+      <w:r>
+        <w:rPr>
+          <w:i/>
+          <w:iCs/>
+          <w:color w:val="666666"/>
+          <w:sz w:val="20"/>
+          <w:szCs w:val="20"/>
+        </w:rPr>
+        <w:t xml:space="preserve">Dual-shore US+India EMS model + India-EMS PLI/ECMS/ISM 2.0 structural tailwind is real; explicit size math (~Rs15,000cr, needs ~Rs1.5 lakh crore) rules out tam; mix-shift to box-build (60% of revenue) is a genuine differentiating moat for aerospace/defence/rail customers; growth-at-a-premium with real multiple-compression risk — valuation no.</w:t>
       </w:r>
     </w:p>
     <w:p>

</xml_diff>